<commit_message>
docs: deepen technical doc + document PageIndex (mode, diagram, benchmark)
- TECHNICAL.md rewritten as a deep reference: code excerpts, chunking algorithm,
  e5 prefix mechanism, cache-key, hybrid retriever internals, PageIndex tree +
  navigation, guardrail calibration data, SSE protocol, API, eval methodology,
  hybrid-vs-pageindex benchmark.
- Word doc: new PageIndex chapter + diagram (d9) + comparison table; validated.
- README + design doc updated (RETRIEVAL_MODE, PageIndex usage/eval).

Co-Authored-By: Claude Opus 4.8 <noreply@anthropic.com>
</commit_message>
<xml_diff>
--- a/docs/Technische_Dokumentation.docx
+++ b/docs/Technische_Dokumentation.docx
@@ -935,10 +935,10 @@
     </w:p>
     <w:p>
       <w:pPr>
-        <w:pStyle w:val="Heading1"/>
-      </w:pPr>
-      <w:r>
-        <w:t xml:space="preserve">4. Guardrail — Schutz vor Halluzination</w:t>
+        <w:pStyle w:val="Heading2"/>
+      </w:pPr>
+      <w:r>
+        <w:t xml:space="preserve">3.3 Alternatives Retrieval — PageIndex (vectorless)</w:t>
       </w:r>
     </w:p>
     <w:p>
@@ -947,27 +947,24 @@
         <w:jc w:val="both"/>
       </w:pPr>
       <w:r>
-        <w:t xml:space="preserve">Der Reranker liefert Relevanz-Scores zwischen 0 und 1. Kalibriert auf der Zielmaschine: fachlich passende Fragen scoren </w:t>
-      </w:r>
-      <w:r>
         <w:rPr>
           <w:b/>
           <w:bCs/>
         </w:rPr>
-        <w:t xml:space="preserve">≥ 0,435</w:t>
-      </w:r>
-      <w:r>
-        <w:t xml:space="preserve">, fachfremde </w:t>
+        <w:t xml:space="preserve">PageIndex</w:t>
+      </w:r>
+      <w:r>
+        <w:t xml:space="preserve"> (VectifyAI) ist ein reasoning-basiertes Retrieval ohne Embeddings: Offline wird ein hierarchischer </w:t>
       </w:r>
       <w:r>
         <w:rPr>
           <w:b/>
           <w:bCs/>
         </w:rPr>
-        <w:t xml:space="preserve">≈ 0,000</w:t>
-      </w:r>
-      <w:r>
-        <w:t xml:space="preserve">. Liegt der beste Score unter der Schwelle </w:t>
+        <w:t xml:space="preserve">Tree-Index</w:t>
+      </w:r>
+      <w:r>
+        <w:t xml:space="preserve"> (Inhaltsverzeichnis mit Zusammenfassungen) gebaut; zur Laufzeit navigiert ein Sprachmodell diesen Baum und wählt die relevanten Abschnitte aus — wie ein Mensch, der ein Inhaltsverzeichnis nutzt. Die Auswahl ist dadurch nachvollziehbar. Läuft vollständig lokal (LiteLLM zu LM Studio) und ist per </w:t>
       </w:r>
       <w:r>
         <w:rPr>
@@ -976,20 +973,10 @@
           <w:sz w:val="20"/>
           <w:szCs w:val="20"/>
         </w:rPr>
-        <w:t xml:space="preserve">0.15</w:t>
-      </w:r>
-      <w:r>
-        <w:t xml:space="preserve">, wird </w:t>
-      </w:r>
-      <w:r>
-        <w:rPr>
-          <w:b/>
-          <w:bCs/>
-        </w:rPr>
-        <w:t xml:space="preserve">ohne Sprachmodell-Aufruf</w:t>
-      </w:r>
-      <w:r>
-        <w:t xml:space="preserve"> mit „das steht nicht im Handbuch“ geantwortet. Als zweite Schicht weist der Prompt das Modell an, bei fehlender Information ehrlich zu sein.</w:t>
+        <w:t xml:space="preserve">RETRIEVAL_MODE=pageindex</w:t>
+      </w:r>
+      <w:r>
+        <w:t xml:space="preserve"> aktivierbar.</w:t>
       </w:r>
     </w:p>
     <w:p>
@@ -1000,9 +987,9 @@
       <w:r>
         <w:drawing>
           <wp:inline distT="0" distB="0" distL="0" distR="0">
-            <wp:extent cx="6000750" cy="3448050"/>
+            <wp:extent cx="6000750" cy="3267075"/>
             <wp:effectExtent t="0" r="0" b="0" l="0"/>
-            <wp:docPr id="1" name="d6_guardrail.png" descr="Abbildung 6: Guardrail — kalibrierte Score-Schwelle trennt In- und Out-of-Scope." title="Abbildung 6: Guardrail — kalibrierte Score-Schwelle trennt In- und Out-of-Scope."/>
+            <wp:docPr id="1" name="d9_pageindex.png" descr="Abbildung 6: PageIndex — das Sprachmodell navigiert den Abschnitts-Baum, statt Vektor-Ähnlichkeit zu berechnen." title="Abbildung 6: PageIndex — das Sprachmodell navigiert den Abschnitts-Baum, statt Vektor-Ähnlichkeit zu berechnen."/>
             <wp:cNvGraphicFramePr>
               <a:graphicFrameLocks xmlns:a="http://schemas.openxmlformats.org/drawingml/2006/main" noChangeAspect="1"/>
             </wp:cNvGraphicFramePr>
@@ -1025,7 +1012,7 @@
                   <pic:spPr bwMode="auto">
                     <a:xfrm>
                       <a:off x="0" y="0"/>
-                      <a:ext cx="6000750" cy="3448050"/>
+                      <a:ext cx="6000750" cy="3267075"/>
                     </a:xfrm>
                     <a:prstGeom prst="rect">
                       <a:avLst/>
@@ -1051,15 +1038,7 @@
           <w:sz w:val="18"/>
           <w:szCs w:val="18"/>
         </w:rPr>
-        <w:t xml:space="preserve">Abbildung 6: Guardrail — kalibrierte Score-Schwelle trennt In- und Out-of-Scope.</w:t>
-      </w:r>
-    </w:p>
-    <w:p>
-      <w:pPr>
-        <w:pStyle w:val="Heading1"/>
-      </w:pPr>
-      <w:r>
-        <w:t xml:space="preserve">5. Antwortgenerierung und Streaming</w:t>
+        <w:t xml:space="preserve">Abbildung 6: PageIndex — das Sprachmodell navigiert den Abschnitts-Baum, statt Vektor-Ähnlichkeit zu berechnen.</w:t>
       </w:r>
     </w:p>
     <w:p>
@@ -1068,7 +1047,629 @@
         <w:jc w:val="both"/>
       </w:pPr>
       <w:r>
-        <w:t xml:space="preserve">Die Top-5-Chunks bilden den Kontext eines Prompts, den ein lokales Modell in LM Studio beantwortet (Standard: </w:t>
+        <w:t xml:space="preserve">Direkter Vergleich auf denselben 10 Fragen (lokal gemessen):</w:t>
+      </w:r>
+    </w:p>
+    <w:tbl>
+      <w:tblPr>
+        <w:tblW w:type="dxa" w:w="9360"/>
+        <w:tblBorders>
+          <w:top w:val="single" w:color="auto" w:sz="4"/>
+          <w:left w:val="single" w:color="auto" w:sz="4"/>
+          <w:bottom w:val="single" w:color="auto" w:sz="4"/>
+          <w:right w:val="single" w:color="auto" w:sz="4"/>
+          <w:insideH w:val="single" w:color="auto" w:sz="4"/>
+          <w:insideV w:val="single" w:color="auto" w:sz="4"/>
+        </w:tblBorders>
+      </w:tblPr>
+      <w:tblGrid>
+        <w:gridCol w:w="2600"/>
+        <w:gridCol w:w="3380"/>
+        <w:gridCol w:w="3380"/>
+      </w:tblGrid>
+      <w:tr>
+        <w:trPr>
+          <w:tblHeader/>
+        </w:trPr>
+        <w:tc>
+          <w:tcPr>
+            <w:tcW w:type="dxa" w:w="2600"/>
+            <w:tcBorders>
+              <w:top w:val="single" w:color="CCCCCC" w:sz="1"/>
+              <w:left w:val="single" w:color="CCCCCC" w:sz="1"/>
+              <w:bottom w:val="single" w:color="CCCCCC" w:sz="1"/>
+              <w:right w:val="single" w:color="CCCCCC" w:sz="1"/>
+            </w:tcBorders>
+            <w:shd w:fill="D5E8F0" w:val="clear"/>
+            <w:tcMar>
+              <w:top w:type="dxa" w:w="60"/>
+              <w:left w:type="dxa" w:w="120"/>
+              <w:bottom w:type="dxa" w:w="60"/>
+              <w:right w:type="dxa" w:w="120"/>
+            </w:tcMar>
+          </w:tcPr>
+          <w:p>
+            <w:r>
+              <w:rPr>
+                <w:b/>
+                <w:bCs/>
+                <w:sz w:val="19"/>
+                <w:szCs w:val="19"/>
+              </w:rPr>
+              <w:t xml:space="preserve">Metrik</w:t>
+            </w:r>
+          </w:p>
+        </w:tc>
+        <w:tc>
+          <w:tcPr>
+            <w:tcW w:type="dxa" w:w="3380"/>
+            <w:tcBorders>
+              <w:top w:val="single" w:color="CCCCCC" w:sz="1"/>
+              <w:left w:val="single" w:color="CCCCCC" w:sz="1"/>
+              <w:bottom w:val="single" w:color="CCCCCC" w:sz="1"/>
+              <w:right w:val="single" w:color="CCCCCC" w:sz="1"/>
+            </w:tcBorders>
+            <w:shd w:fill="D5E8F0" w:val="clear"/>
+            <w:tcMar>
+              <w:top w:type="dxa" w:w="60"/>
+              <w:left w:type="dxa" w:w="120"/>
+              <w:bottom w:type="dxa" w:w="60"/>
+              <w:right w:type="dxa" w:w="120"/>
+            </w:tcMar>
+          </w:tcPr>
+          <w:p>
+            <w:r>
+              <w:rPr>
+                <w:b/>
+                <w:bCs/>
+                <w:sz w:val="19"/>
+                <w:szCs w:val="19"/>
+              </w:rPr>
+              <w:t xml:space="preserve">Hybrid + Reranking</w:t>
+            </w:r>
+          </w:p>
+        </w:tc>
+        <w:tc>
+          <w:tcPr>
+            <w:tcW w:type="dxa" w:w="3380"/>
+            <w:tcBorders>
+              <w:top w:val="single" w:color="CCCCCC" w:sz="1"/>
+              <w:left w:val="single" w:color="CCCCCC" w:sz="1"/>
+              <w:bottom w:val="single" w:color="CCCCCC" w:sz="1"/>
+              <w:right w:val="single" w:color="CCCCCC" w:sz="1"/>
+            </w:tcBorders>
+            <w:shd w:fill="D5E8F0" w:val="clear"/>
+            <w:tcMar>
+              <w:top w:type="dxa" w:w="60"/>
+              <w:left w:type="dxa" w:w="120"/>
+              <w:bottom w:type="dxa" w:w="60"/>
+              <w:right w:type="dxa" w:w="120"/>
+            </w:tcMar>
+          </w:tcPr>
+          <w:p>
+            <w:r>
+              <w:rPr>
+                <w:b/>
+                <w:bCs/>
+                <w:sz w:val="19"/>
+                <w:szCs w:val="19"/>
+              </w:rPr>
+              <w:t xml:space="preserve">PageIndex (vectorless)</w:t>
+            </w:r>
+          </w:p>
+        </w:tc>
+      </w:tr>
+      <w:tr>
+        <w:trPr>
+          <w:tblHeader w:val="false"/>
+        </w:trPr>
+        <w:tc>
+          <w:tcPr>
+            <w:tcW w:type="dxa" w:w="2600"/>
+            <w:tcBorders>
+              <w:top w:val="single" w:color="CCCCCC" w:sz="1"/>
+              <w:left w:val="single" w:color="CCCCCC" w:sz="1"/>
+              <w:bottom w:val="single" w:color="CCCCCC" w:sz="1"/>
+              <w:right w:val="single" w:color="CCCCCC" w:sz="1"/>
+            </w:tcBorders>
+            <w:shd w:fill="FFFFFF" w:val="clear"/>
+            <w:tcMar>
+              <w:top w:type="dxa" w:w="60"/>
+              <w:left w:type="dxa" w:w="120"/>
+              <w:bottom w:type="dxa" w:w="60"/>
+              <w:right w:type="dxa" w:w="120"/>
+            </w:tcMar>
+          </w:tcPr>
+          <w:p>
+            <w:r>
+              <w:rPr>
+                <w:b w:val="false"/>
+                <w:bCs w:val="false"/>
+                <w:sz w:val="19"/>
+                <w:szCs w:val="19"/>
+              </w:rPr>
+              <w:t xml:space="preserve">Trefferquote</w:t>
+            </w:r>
+          </w:p>
+        </w:tc>
+        <w:tc>
+          <w:tcPr>
+            <w:tcW w:type="dxa" w:w="3380"/>
+            <w:tcBorders>
+              <w:top w:val="single" w:color="CCCCCC" w:sz="1"/>
+              <w:left w:val="single" w:color="CCCCCC" w:sz="1"/>
+              <w:bottom w:val="single" w:color="CCCCCC" w:sz="1"/>
+              <w:right w:val="single" w:color="CCCCCC" w:sz="1"/>
+            </w:tcBorders>
+            <w:shd w:fill="FFFFFF" w:val="clear"/>
+            <w:tcMar>
+              <w:top w:type="dxa" w:w="60"/>
+              <w:left w:type="dxa" w:w="120"/>
+              <w:bottom w:type="dxa" w:w="60"/>
+              <w:right w:type="dxa" w:w="120"/>
+            </w:tcMar>
+          </w:tcPr>
+          <w:p>
+            <w:r>
+              <w:rPr>
+                <w:b w:val="false"/>
+                <w:bCs w:val="false"/>
+                <w:sz w:val="19"/>
+                <w:szCs w:val="19"/>
+              </w:rPr>
+              <w:t xml:space="preserve">100 %</w:t>
+            </w:r>
+          </w:p>
+        </w:tc>
+        <w:tc>
+          <w:tcPr>
+            <w:tcW w:type="dxa" w:w="3380"/>
+            <w:tcBorders>
+              <w:top w:val="single" w:color="CCCCCC" w:sz="1"/>
+              <w:left w:val="single" w:color="CCCCCC" w:sz="1"/>
+              <w:bottom w:val="single" w:color="CCCCCC" w:sz="1"/>
+              <w:right w:val="single" w:color="CCCCCC" w:sz="1"/>
+            </w:tcBorders>
+            <w:shd w:fill="FFFFFF" w:val="clear"/>
+            <w:tcMar>
+              <w:top w:type="dxa" w:w="60"/>
+              <w:left w:type="dxa" w:w="120"/>
+              <w:bottom w:type="dxa" w:w="60"/>
+              <w:right w:type="dxa" w:w="120"/>
+            </w:tcMar>
+          </w:tcPr>
+          <w:p>
+            <w:r>
+              <w:rPr>
+                <w:b w:val="false"/>
+                <w:bCs w:val="false"/>
+                <w:sz w:val="19"/>
+                <w:szCs w:val="19"/>
+              </w:rPr>
+              <w:t xml:space="preserve">100 %</w:t>
+            </w:r>
+          </w:p>
+        </w:tc>
+      </w:tr>
+      <w:tr>
+        <w:trPr>
+          <w:tblHeader w:val="false"/>
+        </w:trPr>
+        <w:tc>
+          <w:tcPr>
+            <w:tcW w:type="dxa" w:w="2600"/>
+            <w:tcBorders>
+              <w:top w:val="single" w:color="CCCCCC" w:sz="1"/>
+              <w:left w:val="single" w:color="CCCCCC" w:sz="1"/>
+              <w:bottom w:val="single" w:color="CCCCCC" w:sz="1"/>
+              <w:right w:val="single" w:color="CCCCCC" w:sz="1"/>
+            </w:tcBorders>
+            <w:shd w:fill="FFFFFF" w:val="clear"/>
+            <w:tcMar>
+              <w:top w:type="dxa" w:w="60"/>
+              <w:left w:type="dxa" w:w="120"/>
+              <w:bottom w:type="dxa" w:w="60"/>
+              <w:right w:type="dxa" w:w="120"/>
+            </w:tcMar>
+          </w:tcPr>
+          <w:p>
+            <w:r>
+              <w:rPr>
+                <w:b w:val="false"/>
+                <w:bCs w:val="false"/>
+                <w:sz w:val="19"/>
+                <w:szCs w:val="19"/>
+              </w:rPr>
+              <w:t xml:space="preserve">hit@1</w:t>
+            </w:r>
+          </w:p>
+        </w:tc>
+        <w:tc>
+          <w:tcPr>
+            <w:tcW w:type="dxa" w:w="3380"/>
+            <w:tcBorders>
+              <w:top w:val="single" w:color="CCCCCC" w:sz="1"/>
+              <w:left w:val="single" w:color="CCCCCC" w:sz="1"/>
+              <w:bottom w:val="single" w:color="CCCCCC" w:sz="1"/>
+              <w:right w:val="single" w:color="CCCCCC" w:sz="1"/>
+            </w:tcBorders>
+            <w:shd w:fill="FFFFFF" w:val="clear"/>
+            <w:tcMar>
+              <w:top w:type="dxa" w:w="60"/>
+              <w:left w:type="dxa" w:w="120"/>
+              <w:bottom w:type="dxa" w:w="60"/>
+              <w:right w:type="dxa" w:w="120"/>
+            </w:tcMar>
+          </w:tcPr>
+          <w:p>
+            <w:r>
+              <w:rPr>
+                <w:b w:val="false"/>
+                <w:bCs w:val="false"/>
+                <w:sz w:val="19"/>
+                <w:szCs w:val="19"/>
+              </w:rPr>
+              <w:t xml:space="preserve">100 %</w:t>
+            </w:r>
+          </w:p>
+        </w:tc>
+        <w:tc>
+          <w:tcPr>
+            <w:tcW w:type="dxa" w:w="3380"/>
+            <w:tcBorders>
+              <w:top w:val="single" w:color="CCCCCC" w:sz="1"/>
+              <w:left w:val="single" w:color="CCCCCC" w:sz="1"/>
+              <w:bottom w:val="single" w:color="CCCCCC" w:sz="1"/>
+              <w:right w:val="single" w:color="CCCCCC" w:sz="1"/>
+            </w:tcBorders>
+            <w:shd w:fill="FFFFFF" w:val="clear"/>
+            <w:tcMar>
+              <w:top w:type="dxa" w:w="60"/>
+              <w:left w:type="dxa" w:w="120"/>
+              <w:bottom w:type="dxa" w:w="60"/>
+              <w:right w:type="dxa" w:w="120"/>
+            </w:tcMar>
+          </w:tcPr>
+          <w:p>
+            <w:r>
+              <w:rPr>
+                <w:b w:val="false"/>
+                <w:bCs w:val="false"/>
+                <w:sz w:val="19"/>
+                <w:szCs w:val="19"/>
+              </w:rPr>
+              <w:t xml:space="preserve">70 %</w:t>
+            </w:r>
+          </w:p>
+        </w:tc>
+      </w:tr>
+      <w:tr>
+        <w:trPr>
+          <w:tblHeader w:val="false"/>
+        </w:trPr>
+        <w:tc>
+          <w:tcPr>
+            <w:tcW w:type="dxa" w:w="2600"/>
+            <w:tcBorders>
+              <w:top w:val="single" w:color="CCCCCC" w:sz="1"/>
+              <w:left w:val="single" w:color="CCCCCC" w:sz="1"/>
+              <w:bottom w:val="single" w:color="CCCCCC" w:sz="1"/>
+              <w:right w:val="single" w:color="CCCCCC" w:sz="1"/>
+            </w:tcBorders>
+            <w:shd w:fill="FFFFFF" w:val="clear"/>
+            <w:tcMar>
+              <w:top w:type="dxa" w:w="60"/>
+              <w:left w:type="dxa" w:w="120"/>
+              <w:bottom w:type="dxa" w:w="60"/>
+              <w:right w:type="dxa" w:w="120"/>
+            </w:tcMar>
+          </w:tcPr>
+          <w:p>
+            <w:r>
+              <w:rPr>
+                <w:b w:val="false"/>
+                <w:bCs w:val="false"/>
+                <w:sz w:val="19"/>
+                <w:szCs w:val="19"/>
+              </w:rPr>
+              <w:t xml:space="preserve">MRR</w:t>
+            </w:r>
+          </w:p>
+        </w:tc>
+        <w:tc>
+          <w:tcPr>
+            <w:tcW w:type="dxa" w:w="3380"/>
+            <w:tcBorders>
+              <w:top w:val="single" w:color="CCCCCC" w:sz="1"/>
+              <w:left w:val="single" w:color="CCCCCC" w:sz="1"/>
+              <w:bottom w:val="single" w:color="CCCCCC" w:sz="1"/>
+              <w:right w:val="single" w:color="CCCCCC" w:sz="1"/>
+            </w:tcBorders>
+            <w:shd w:fill="FFFFFF" w:val="clear"/>
+            <w:tcMar>
+              <w:top w:type="dxa" w:w="60"/>
+              <w:left w:type="dxa" w:w="120"/>
+              <w:bottom w:type="dxa" w:w="60"/>
+              <w:right w:type="dxa" w:w="120"/>
+            </w:tcMar>
+          </w:tcPr>
+          <w:p>
+            <w:r>
+              <w:rPr>
+                <w:b w:val="false"/>
+                <w:bCs w:val="false"/>
+                <w:sz w:val="19"/>
+                <w:szCs w:val="19"/>
+              </w:rPr>
+              <w:t xml:space="preserve">1,00</w:t>
+            </w:r>
+          </w:p>
+        </w:tc>
+        <w:tc>
+          <w:tcPr>
+            <w:tcW w:type="dxa" w:w="3380"/>
+            <w:tcBorders>
+              <w:top w:val="single" w:color="CCCCCC" w:sz="1"/>
+              <w:left w:val="single" w:color="CCCCCC" w:sz="1"/>
+              <w:bottom w:val="single" w:color="CCCCCC" w:sz="1"/>
+              <w:right w:val="single" w:color="CCCCCC" w:sz="1"/>
+            </w:tcBorders>
+            <w:shd w:fill="FFFFFF" w:val="clear"/>
+            <w:tcMar>
+              <w:top w:type="dxa" w:w="60"/>
+              <w:left w:type="dxa" w:w="120"/>
+              <w:bottom w:type="dxa" w:w="60"/>
+              <w:right w:type="dxa" w:w="120"/>
+            </w:tcMar>
+          </w:tcPr>
+          <w:p>
+            <w:r>
+              <w:rPr>
+                <w:b w:val="false"/>
+                <w:bCs w:val="false"/>
+                <w:sz w:val="19"/>
+                <w:szCs w:val="19"/>
+              </w:rPr>
+              <w:t xml:space="preserve">0,82</w:t>
+            </w:r>
+          </w:p>
+        </w:tc>
+      </w:tr>
+      <w:tr>
+        <w:trPr>
+          <w:tblHeader w:val="false"/>
+        </w:trPr>
+        <w:tc>
+          <w:tcPr>
+            <w:tcW w:type="dxa" w:w="2600"/>
+            <w:tcBorders>
+              <w:top w:val="single" w:color="CCCCCC" w:sz="1"/>
+              <w:left w:val="single" w:color="CCCCCC" w:sz="1"/>
+              <w:bottom w:val="single" w:color="CCCCCC" w:sz="1"/>
+              <w:right w:val="single" w:color="CCCCCC" w:sz="1"/>
+            </w:tcBorders>
+            <w:shd w:fill="FFFFFF" w:val="clear"/>
+            <w:tcMar>
+              <w:top w:type="dxa" w:w="60"/>
+              <w:left w:type="dxa" w:w="120"/>
+              <w:bottom w:type="dxa" w:w="60"/>
+              <w:right w:type="dxa" w:w="120"/>
+            </w:tcMar>
+          </w:tcPr>
+          <w:p>
+            <w:r>
+              <w:rPr>
+                <w:b w:val="false"/>
+                <w:bCs w:val="false"/>
+                <w:sz w:val="19"/>
+                <w:szCs w:val="19"/>
+              </w:rPr>
+              <w:t xml:space="preserve">Ø Recall</w:t>
+            </w:r>
+          </w:p>
+        </w:tc>
+        <w:tc>
+          <w:tcPr>
+            <w:tcW w:type="dxa" w:w="3380"/>
+            <w:tcBorders>
+              <w:top w:val="single" w:color="CCCCCC" w:sz="1"/>
+              <w:left w:val="single" w:color="CCCCCC" w:sz="1"/>
+              <w:bottom w:val="single" w:color="CCCCCC" w:sz="1"/>
+              <w:right w:val="single" w:color="CCCCCC" w:sz="1"/>
+            </w:tcBorders>
+            <w:shd w:fill="FFFFFF" w:val="clear"/>
+            <w:tcMar>
+              <w:top w:type="dxa" w:w="60"/>
+              <w:left w:type="dxa" w:w="120"/>
+              <w:bottom w:type="dxa" w:w="60"/>
+              <w:right w:type="dxa" w:w="120"/>
+            </w:tcMar>
+          </w:tcPr>
+          <w:p>
+            <w:r>
+              <w:rPr>
+                <w:b w:val="false"/>
+                <w:bCs w:val="false"/>
+                <w:sz w:val="19"/>
+                <w:szCs w:val="19"/>
+              </w:rPr>
+              <w:t xml:space="preserve">96 %</w:t>
+            </w:r>
+          </w:p>
+        </w:tc>
+        <w:tc>
+          <w:tcPr>
+            <w:tcW w:type="dxa" w:w="3380"/>
+            <w:tcBorders>
+              <w:top w:val="single" w:color="CCCCCC" w:sz="1"/>
+              <w:left w:val="single" w:color="CCCCCC" w:sz="1"/>
+              <w:bottom w:val="single" w:color="CCCCCC" w:sz="1"/>
+              <w:right w:val="single" w:color="CCCCCC" w:sz="1"/>
+            </w:tcBorders>
+            <w:shd w:fill="FFFFFF" w:val="clear"/>
+            <w:tcMar>
+              <w:top w:type="dxa" w:w="60"/>
+              <w:left w:type="dxa" w:w="120"/>
+              <w:bottom w:type="dxa" w:w="60"/>
+              <w:right w:type="dxa" w:w="120"/>
+            </w:tcMar>
+          </w:tcPr>
+          <w:p>
+            <w:r>
+              <w:rPr>
+                <w:b w:val="false"/>
+                <w:bCs w:val="false"/>
+                <w:sz w:val="19"/>
+                <w:szCs w:val="19"/>
+              </w:rPr>
+              <w:t xml:space="preserve">88 %</w:t>
+            </w:r>
+          </w:p>
+        </w:tc>
+      </w:tr>
+      <w:tr>
+        <w:trPr>
+          <w:tblHeader w:val="false"/>
+        </w:trPr>
+        <w:tc>
+          <w:tcPr>
+            <w:tcW w:type="dxa" w:w="2600"/>
+            <w:tcBorders>
+              <w:top w:val="single" w:color="CCCCCC" w:sz="1"/>
+              <w:left w:val="single" w:color="CCCCCC" w:sz="1"/>
+              <w:bottom w:val="single" w:color="CCCCCC" w:sz="1"/>
+              <w:right w:val="single" w:color="CCCCCC" w:sz="1"/>
+            </w:tcBorders>
+            <w:shd w:fill="FFFFFF" w:val="clear"/>
+            <w:tcMar>
+              <w:top w:type="dxa" w:w="60"/>
+              <w:left w:type="dxa" w:w="120"/>
+              <w:bottom w:type="dxa" w:w="60"/>
+              <w:right w:type="dxa" w:w="120"/>
+            </w:tcMar>
+          </w:tcPr>
+          <w:p>
+            <w:r>
+              <w:rPr>
+                <w:b w:val="false"/>
+                <w:bCs w:val="false"/>
+                <w:sz w:val="19"/>
+                <w:szCs w:val="19"/>
+              </w:rPr>
+              <w:t xml:space="preserve">Latenz je Frage</w:t>
+            </w:r>
+          </w:p>
+        </w:tc>
+        <w:tc>
+          <w:tcPr>
+            <w:tcW w:type="dxa" w:w="3380"/>
+            <w:tcBorders>
+              <w:top w:val="single" w:color="CCCCCC" w:sz="1"/>
+              <w:left w:val="single" w:color="CCCCCC" w:sz="1"/>
+              <w:bottom w:val="single" w:color="CCCCCC" w:sz="1"/>
+              <w:right w:val="single" w:color="CCCCCC" w:sz="1"/>
+            </w:tcBorders>
+            <w:shd w:fill="FFFFFF" w:val="clear"/>
+            <w:tcMar>
+              <w:top w:type="dxa" w:w="60"/>
+              <w:left w:type="dxa" w:w="120"/>
+              <w:bottom w:type="dxa" w:w="60"/>
+              <w:right w:type="dxa" w:w="120"/>
+            </w:tcMar>
+          </w:tcPr>
+          <w:p>
+            <w:r>
+              <w:rPr>
+                <w:b w:val="false"/>
+                <w:bCs w:val="false"/>
+                <w:sz w:val="19"/>
+                <w:szCs w:val="19"/>
+              </w:rPr>
+              <w:t xml:space="preserve">~sofort (LLM-frei)</w:t>
+            </w:r>
+          </w:p>
+        </w:tc>
+        <w:tc>
+          <w:tcPr>
+            <w:tcW w:type="dxa" w:w="3380"/>
+            <w:tcBorders>
+              <w:top w:val="single" w:color="CCCCCC" w:sz="1"/>
+              <w:left w:val="single" w:color="CCCCCC" w:sz="1"/>
+              <w:bottom w:val="single" w:color="CCCCCC" w:sz="1"/>
+              <w:right w:val="single" w:color="CCCCCC" w:sz="1"/>
+            </w:tcBorders>
+            <w:shd w:fill="FFFFFF" w:val="clear"/>
+            <w:tcMar>
+              <w:top w:type="dxa" w:w="60"/>
+              <w:left w:type="dxa" w:w="120"/>
+              <w:bottom w:type="dxa" w:w="60"/>
+              <w:right w:type="dxa" w:w="120"/>
+            </w:tcMar>
+          </w:tcPr>
+          <w:p>
+            <w:r>
+              <w:rPr>
+                <w:b w:val="false"/>
+                <w:bCs w:val="false"/>
+                <w:sz w:val="19"/>
+                <w:szCs w:val="19"/>
+              </w:rPr>
+              <w:t xml:space="preserve">~104 s (7 LLM-Calls)</w:t>
+            </w:r>
+          </w:p>
+        </w:tc>
+      </w:tr>
+    </w:tbl>
+    <w:p>
+      <w:pPr>
+        <w:spacing w:before="120"/>
+      </w:pPr>
+      <w:r>
+        <w:rPr>
+          <w:i/>
+          <w:iCs/>
+          <w:color w:val="555555"/>
+          <w:sz w:val="20"/>
+          <w:szCs w:val="20"/>
+        </w:rPr>
+        <w:t xml:space="preserve">Beide finden die Fehlercodes zuverlässig. Auf diesem kleinen, flachen Handbuch ist Hybrid schneller und rankt präziser; PageIndex ist der erklärbare, reasoning-basierte Ansatz und spielt seine Stärke bei großen, tief hierarchisch gegliederten Dokumenten aus.</w:t>
+      </w:r>
+    </w:p>
+    <w:p>
+      <w:pPr>
+        <w:pStyle w:val="Heading1"/>
+      </w:pPr>
+      <w:r>
+        <w:t xml:space="preserve">4. Guardrail — Schutz vor Halluzination</w:t>
+      </w:r>
+    </w:p>
+    <w:p>
+      <w:pPr>
+        <w:spacing w:after="120"/>
+        <w:jc w:val="both"/>
+      </w:pPr>
+      <w:r>
+        <w:t xml:space="preserve">Der Reranker liefert Relevanz-Scores zwischen 0 und 1. Kalibriert auf der Zielmaschine: fachlich passende Fragen scoren </w:t>
+      </w:r>
+      <w:r>
+        <w:rPr>
+          <w:b/>
+          <w:bCs/>
+        </w:rPr>
+        <w:t xml:space="preserve">≥ 0,435</w:t>
+      </w:r>
+      <w:r>
+        <w:t xml:space="preserve">, fachfremde </w:t>
+      </w:r>
+      <w:r>
+        <w:rPr>
+          <w:b/>
+          <w:bCs/>
+        </w:rPr>
+        <w:t xml:space="preserve">≈ 0,000</w:t>
+      </w:r>
+      <w:r>
+        <w:t xml:space="preserve">. Liegt der beste Score unter der Schwelle </w:t>
       </w:r>
       <w:r>
         <w:rPr>
@@ -1077,49 +1678,20 @@
           <w:sz w:val="20"/>
           <w:szCs w:val="20"/>
         </w:rPr>
-        <w:t xml:space="preserve">gemma-4-12b-it-mlx</w:t>
-      </w:r>
-      <w:r>
-        <w:t xml:space="preserve">, ein schnelles Nicht-Reasoning-Modell). Der Prompt erzwingt eine </w:t>
+        <w:t xml:space="preserve">0.15</w:t>
+      </w:r>
+      <w:r>
+        <w:t xml:space="preserve">, wird </w:t>
       </w:r>
       <w:r>
         <w:rPr>
           <w:b/>
           <w:bCs/>
         </w:rPr>
-        <w:t xml:space="preserve">strukturierte Ausgabe</w:t>
-      </w:r>
-      <w:r>
-        <w:t xml:space="preserve"> (Zusammenfassung, Handbuch-Schritte, Tipps), die in Karten und Checklisten übersetzt wird. Die </w:t>
-      </w:r>
-      <w:r>
-        <w:rPr>
-          <w:b/>
-          <w:bCs/>
-        </w:rPr>
-        <w:t xml:space="preserve">Quellenangabe</w:t>
-      </w:r>
-      <w:r>
-        <w:t xml:space="preserve"> wird aus den tatsächlich genutzten Chunks abgeleitet („Handbuch: &lt;Abschnitt&gt; · Seite NN“).</w:t>
-      </w:r>
-    </w:p>
-    <w:p>
-      <w:pPr>
-        <w:spacing w:after="120"/>
-        <w:jc w:val="both"/>
-      </w:pPr>
-      <w:r>
-        <w:t xml:space="preserve">Die Antwort wird per </w:t>
-      </w:r>
-      <w:r>
-        <w:rPr>
-          <w:b/>
-          <w:bCs/>
-        </w:rPr>
-        <w:t xml:space="preserve">Server-Sent Events (SSE)</w:t>
-      </w:r>
-      <w:r>
-        <w:t xml:space="preserve"> gestreamt: Der Nutzer sieht die Quelle nach ~1 Sekunde und die Antwort beim Entstehen — statt minutenlang auf einen Spinner zu warten. Da der eingebaute Streaming-Pfad der RAG-Bibliothek puffert, wird das Sprachmodell direkt gestreamt.</w:t>
+        <w:t xml:space="preserve">ohne Sprachmodell-Aufruf</w:t>
+      </w:r>
+      <w:r>
+        <w:t xml:space="preserve"> mit „das steht nicht im Handbuch“ geantwortet. Als zweite Schicht weist der Prompt das Modell an, bei fehlender Information ehrlich zu sein.</w:t>
       </w:r>
     </w:p>
     <w:p>
@@ -1130,9 +1702,9 @@
       <w:r>
         <w:drawing>
           <wp:inline distT="0" distB="0" distL="0" distR="0">
-            <wp:extent cx="6000750" cy="3867150"/>
+            <wp:extent cx="6000750" cy="3448050"/>
             <wp:effectExtent t="0" r="0" b="0" l="0"/>
-            <wp:docPr id="1" name="d7_streaming.png" descr="Abbildung 7: Streaming-Ablauf — Quelle sofort, Antwort Token für Token." title="Abbildung 7: Streaming-Ablauf — Quelle sofort, Antwort Token für Token."/>
+            <wp:docPr id="1" name="d6_guardrail.png" descr="Abbildung 7: Guardrail — kalibrierte Score-Schwelle trennt In- und Out-of-Scope." title="Abbildung 7: Guardrail — kalibrierte Score-Schwelle trennt In- und Out-of-Scope."/>
             <wp:cNvGraphicFramePr>
               <a:graphicFrameLocks xmlns:a="http://schemas.openxmlformats.org/drawingml/2006/main" noChangeAspect="1"/>
             </wp:cNvGraphicFramePr>
@@ -1155,7 +1727,7 @@
                   <pic:spPr bwMode="auto">
                     <a:xfrm>
                       <a:off x="0" y="0"/>
-                      <a:ext cx="6000750" cy="3867150"/>
+                      <a:ext cx="6000750" cy="3448050"/>
                     </a:xfrm>
                     <a:prstGeom prst="rect">
                       <a:avLst/>
@@ -1181,12 +1753,7 @@
           <w:sz w:val="18"/>
           <w:szCs w:val="18"/>
         </w:rPr>
-        <w:t xml:space="preserve">Abbildung 7: Streaming-Ablauf — Quelle sofort, Antwort Token für Token.</w:t>
-      </w:r>
-    </w:p>
-    <w:p>
-      <w:r>
-        <w:br w:type="page"/>
+        <w:t xml:space="preserve">Abbildung 7: Guardrail — kalibrierte Score-Schwelle trennt In- und Out-of-Scope.</w:t>
       </w:r>
     </w:p>
     <w:p>
@@ -1194,7 +1761,7 @@
         <w:pStyle w:val="Heading1"/>
       </w:pPr>
       <w:r>
-        <w:t xml:space="preserve">6. Ergebnisse (Evaluation)</w:t>
+        <w:t xml:space="preserve">5. Antwortgenerierung und Streaming</w:t>
       </w:r>
     </w:p>
     <w:p>
@@ -1203,17 +1770,58 @@
         <w:jc w:val="both"/>
       </w:pPr>
       <w:r>
-        <w:t xml:space="preserve">Ein Eval-Skript misst die </w:t>
+        <w:t xml:space="preserve">Die Top-5-Chunks bilden den Kontext eines Prompts, den ein lokales Modell in LM Studio beantwortet (Standard: </w:t>
+      </w:r>
+      <w:r>
+        <w:rPr>
+          <w:rFonts w:ascii="Consolas" w:cs="Consolas" w:eastAsia="Consolas" w:hAnsi="Consolas"/>
+          <w:color w:val="0A3D62"/>
+          <w:sz w:val="20"/>
+          <w:szCs w:val="20"/>
+        </w:rPr>
+        <w:t xml:space="preserve">gemma-4-12b-it-mlx</w:t>
+      </w:r>
+      <w:r>
+        <w:t xml:space="preserve">, ein schnelles Nicht-Reasoning-Modell). Der Prompt erzwingt eine </w:t>
       </w:r>
       <w:r>
         <w:rPr>
           <w:b/>
           <w:bCs/>
         </w:rPr>
-        <w:t xml:space="preserve">Retrieval-Qualität ohne Sprachmodell</w:t>
-      </w:r>
-      <w:r>
-        <w:t xml:space="preserve"> an 10 realen Störungsfragen, deren erwartete Stichwörter aus den echten Handbuch-Tabellen stammen. Verglichen wird die Ausgangsversion mit der optimierten Version (auf der Zielmaschine gemessen):</w:t>
+        <w:t xml:space="preserve">strukturierte Ausgabe</w:t>
+      </w:r>
+      <w:r>
+        <w:t xml:space="preserve"> (Zusammenfassung, Handbuch-Schritte, Tipps), die in Karten und Checklisten übersetzt wird. Die </w:t>
+      </w:r>
+      <w:r>
+        <w:rPr>
+          <w:b/>
+          <w:bCs/>
+        </w:rPr>
+        <w:t xml:space="preserve">Quellenangabe</w:t>
+      </w:r>
+      <w:r>
+        <w:t xml:space="preserve"> wird aus den tatsächlich genutzten Chunks abgeleitet („Handbuch: &lt;Abschnitt&gt; · Seite NN“).</w:t>
+      </w:r>
+    </w:p>
+    <w:p>
+      <w:pPr>
+        <w:spacing w:after="120"/>
+        <w:jc w:val="both"/>
+      </w:pPr>
+      <w:r>
+        <w:t xml:space="preserve">Die Antwort wird per </w:t>
+      </w:r>
+      <w:r>
+        <w:rPr>
+          <w:b/>
+          <w:bCs/>
+        </w:rPr>
+        <w:t xml:space="preserve">Server-Sent Events (SSE)</w:t>
+      </w:r>
+      <w:r>
+        <w:t xml:space="preserve"> gestreamt: Der Nutzer sieht die Quelle nach ~1 Sekunde und die Antwort beim Entstehen — statt minutenlang auf einen Spinner zu warten. Da der eingebaute Streaming-Pfad der RAG-Bibliothek puffert, wird das Sprachmodell direkt gestreamt.</w:t>
       </w:r>
     </w:p>
     <w:p>
@@ -1224,9 +1832,9 @@
       <w:r>
         <w:drawing>
           <wp:inline distT="0" distB="0" distL="0" distR="0">
-            <wp:extent cx="6000750" cy="3714750"/>
+            <wp:extent cx="6000750" cy="3867150"/>
             <wp:effectExtent t="0" r="0" b="0" l="0"/>
-            <wp:docPr id="1" name="d8_eval.png" descr="Abbildung 8: Retrieval-Qualität vorher/nachher." title="Abbildung 8: Retrieval-Qualität vorher/nachher."/>
+            <wp:docPr id="1" name="d7_streaming.png" descr="Abbildung 8: Streaming-Ablauf — Quelle sofort, Antwort Token für Token." title="Abbildung 8: Streaming-Ablauf — Quelle sofort, Antwort Token für Token."/>
             <wp:cNvGraphicFramePr>
               <a:graphicFrameLocks xmlns:a="http://schemas.openxmlformats.org/drawingml/2006/main" noChangeAspect="1"/>
             </wp:cNvGraphicFramePr>
@@ -1249,6 +1857,100 @@
                   <pic:spPr bwMode="auto">
                     <a:xfrm>
                       <a:off x="0" y="0"/>
+                      <a:ext cx="6000750" cy="3867150"/>
+                    </a:xfrm>
+                    <a:prstGeom prst="rect">
+                      <a:avLst/>
+                    </a:prstGeom>
+                  </pic:spPr>
+                </pic:pic>
+              </a:graphicData>
+            </a:graphic>
+          </wp:inline>
+        </w:drawing>
+      </w:r>
+    </w:p>
+    <w:p>
+      <w:pPr>
+        <w:spacing w:after="200"/>
+        <w:jc w:val="center"/>
+      </w:pPr>
+      <w:r>
+        <w:rPr>
+          <w:i/>
+          <w:iCs/>
+          <w:color w:val="666666"/>
+          <w:sz w:val="18"/>
+          <w:szCs w:val="18"/>
+        </w:rPr>
+        <w:t xml:space="preserve">Abbildung 8: Streaming-Ablauf — Quelle sofort, Antwort Token für Token.</w:t>
+      </w:r>
+    </w:p>
+    <w:p>
+      <w:r>
+        <w:br w:type="page"/>
+      </w:r>
+    </w:p>
+    <w:p>
+      <w:pPr>
+        <w:pStyle w:val="Heading1"/>
+      </w:pPr>
+      <w:r>
+        <w:t xml:space="preserve">6. Ergebnisse (Evaluation)</w:t>
+      </w:r>
+    </w:p>
+    <w:p>
+      <w:pPr>
+        <w:spacing w:after="120"/>
+        <w:jc w:val="both"/>
+      </w:pPr>
+      <w:r>
+        <w:t xml:space="preserve">Ein Eval-Skript misst die </w:t>
+      </w:r>
+      <w:r>
+        <w:rPr>
+          <w:b/>
+          <w:bCs/>
+        </w:rPr>
+        <w:t xml:space="preserve">Retrieval-Qualität ohne Sprachmodell</w:t>
+      </w:r>
+      <w:r>
+        <w:t xml:space="preserve"> an 10 realen Störungsfragen, deren erwartete Stichwörter aus den echten Handbuch-Tabellen stammen. Verglichen wird die Ausgangsversion mit der optimierten Version (auf der Zielmaschine gemessen):</w:t>
+      </w:r>
+    </w:p>
+    <w:p>
+      <w:pPr>
+        <w:spacing w:after="40" w:before="160"/>
+        <w:jc w:val="center"/>
+      </w:pPr>
+      <w:r>
+        <w:drawing>
+          <wp:inline distT="0" distB="0" distL="0" distR="0">
+            <wp:extent cx="6000750" cy="3714750"/>
+            <wp:effectExtent t="0" r="0" b="0" l="0"/>
+            <wp:docPr id="1" name="d8_eval.png" descr="Abbildung 9: Retrieval-Qualität vorher/nachher." title="Abbildung 9: Retrieval-Qualität vorher/nachher."/>
+            <wp:cNvGraphicFramePr>
+              <a:graphicFrameLocks xmlns:a="http://schemas.openxmlformats.org/drawingml/2006/main" noChangeAspect="1"/>
+            </wp:cNvGraphicFramePr>
+            <a:graphic xmlns:a="http://schemas.openxmlformats.org/drawingml/2006/main">
+              <a:graphicData uri="http://schemas.openxmlformats.org/drawingml/2006/picture">
+                <pic:pic xmlns:pic="http://schemas.openxmlformats.org/drawingml/2006/picture">
+                  <pic:nvPicPr>
+                    <pic:cNvPr id="0" name="" descr=""/>
+                    <pic:cNvPicPr>
+                      <a:picLocks noChangeAspect="1" noChangeArrowheads="1"/>
+                    </pic:cNvPicPr>
+                  </pic:nvPicPr>
+                  <pic:blipFill>
+                    <a:blip r:embed="rId15" cstate="none"/>
+                    <a:srcRect/>
+                    <a:stretch>
+                      <a:fillRect/>
+                    </a:stretch>
+                  </pic:blipFill>
+                  <pic:spPr bwMode="auto">
+                    <a:xfrm>
+                      <a:off x="0" y="0"/>
                       <a:ext cx="6000750" cy="3714750"/>
                     </a:xfrm>
                     <a:prstGeom prst="rect">
@@ -1275,7 +1977,7 @@
           <w:sz w:val="18"/>
           <w:szCs w:val="18"/>
         </w:rPr>
-        <w:t xml:space="preserve">Abbildung 8: Retrieval-Qualität vorher/nachher.</w:t>
+        <w:t xml:space="preserve">Abbildung 9: Retrieval-Qualität vorher/nachher.</w:t>
       </w:r>
     </w:p>
     <w:tbl>

</xml_diff>